<commit_message>
docs: summarize implemented architecture phases
</commit_message>
<xml_diff>
--- a/Docs/Arquitetura/Planejamento_Arquitetura_10_10_Nyvorn.docx
+++ b/Docs/Arquitetura/Planejamento_Arquitetura_10_10_Nyvorn.docx
@@ -5387,6 +5387,118 @@
       </w:tr>
     </w:tbl>
     <w:p/>
+    <w:p>
+      <w:r>
+        <w:br w:type="page"/>
+      </w:r>
+    </w:p>
+    <w:p>
+      <w:pPr>
+        <w:pStyle w:val="Ttulo1"/>
+      </w:pPr>
+      <w:r>
+        <w:t>Resumo de Implementacao Ja Concluida</w:t>
+      </w:r>
+    </w:p>
+    <w:p>
+      <w:r>
+        <w:rPr>
+          <w:b w:val="0"/>
+        </w:rPr>
+        <w:t>Este resumo registra o que do planejamento arquitetural ja saiu do papel e entrou no codigo ate o momento.</w:t>
+      </w:r>
+    </w:p>
+    <w:p>
+      <w:pPr>
+        <w:pStyle w:val="Commarcadores"/>
+      </w:pPr>
+      <w:r>
+        <w:t>Fases 0, 1 e 2 da trilha documental foram criadas em Docs/Arquitetura com os arquivos BASELINE.md, ARCHITECTURE_FLOW.md, ARCHITECTURE_RULES.md e DEPENDENCY_DEBT.md.</w:t>
+      </w:r>
+    </w:p>
+    <w:p>
+      <w:pPr>
+        <w:pStyle w:val="Commarcadores"/>
+      </w:pPr>
+      <w:r>
+        <w:t>Fase 3 foi iniciada e executada com a reducao pratica de responsabilidades da PlayingSession.</w:t>
+      </w:r>
+    </w:p>
+    <w:p>
+      <w:pPr>
+        <w:pStyle w:val="Commarcadores"/>
+      </w:pPr>
+      <w:r>
+        <w:t>O runtime de itens do mundo foi extraido para WorldItemRuntimeSystem, concentrando update, atracao, coleta, drop e spawn de drops de blocos.</w:t>
+      </w:r>
+    </w:p>
+    <w:p>
+      <w:pPr>
+        <w:pStyle w:val="Commarcadores"/>
+      </w:pPr>
+      <w:r>
+        <w:t>A coordenacao visual e de camera foi extraida para PlayingSessionViewCoordinator, concentrando follow da camera, viewport de simulacao, preparacao de terreno, render principal, HUD, minimapa e inventario.</w:t>
+      </w:r>
+    </w:p>
+    <w:p>
+      <w:pPr>
+        <w:pStyle w:val="Commarcadores"/>
+      </w:pPr>
+      <w:r>
+        <w:t>A interacao com blocos foi extraida para PlayingSessionBlockInteractionSystem, concentrando preview, place, break, place de areia por pixel e cooldown associado.</w:t>
+      </w:r>
+    </w:p>
+    <w:p>
+      <w:pPr>
+        <w:pStyle w:val="Commarcadores"/>
+      </w:pPr>
+      <w:r>
+        <w:t>O bloco de tecido foi extraido para PlayingSessionTissueSystem, concentrando reveal, presenca ambiente, ativacao de hubs, radar, fast travel e debug do tecido.</w:t>
+      </w:r>
+    </w:p>
+    <w:p>
+      <w:pPr>
+        <w:pStyle w:val="Commarcadores"/>
+      </w:pPr>
+      <w:r>
+        <w:t>A PlayingSession foi limpa para se aproximar do papel de orquestrador, mantendo fachadas publicas necessarias para PlayingState, InventoryState e persistencia.</w:t>
+      </w:r>
+    </w:p>
+    <w:p>
+      <w:pPr>
+        <w:pStyle w:val="Commarcadores"/>
+      </w:pPr>
+      <w:r>
+        <w:t>Fase 4 foi iniciada com a criacao de SessionRuntimeContext para agrupar referencias-base da sessao como WorldMap, Player, Enemies, WorldItems, Hotbar, Inventory e Camera.</w:t>
+      </w:r>
+    </w:p>
+    <w:p>
+      <w:pPr>
+        <w:pStyle w:val="Commarcadores"/>
+      </w:pPr>
+      <w:r>
+        <w:t>Ainda dentro da Fase 4, o runtime de entidades proximas foi extraido para PlayingSessionEntityRuntimeSystem, concentrando update de inimigos em alcance, runtime de itens proximos, respawn e calculo de alcance com world wrapping.</w:t>
+      </w:r>
+    </w:p>
+    <w:p>
+      <w:pPr>
+        <w:pStyle w:val="Commarcadores"/>
+      </w:pPr>
+      <w:r>
+        <w:t>A PlayingSession continua preservando a ordem do frame, mas ja delega blocos maiores para sistemas especializados, o que prepara os proximos passos sem quebrar o comportamento atual.</w:t>
+      </w:r>
+    </w:p>
+    <w:p>
+      <w:r>
+        <w:rPr>
+          <w:b/>
+        </w:rPr>
+        <w:t xml:space="preserve">Proximos passos naturais dentro do proprio planejamento: </w:t>
+      </w:r>
+      <w:r>
+        <w:t>extrair o roteamento contextual de input da sessao, continuar reduzindo a PlayingSession como ponto de acoplamento e seguir documentando cada corte no fluxo arquitetural.</w:t>
+      </w:r>
+    </w:p>
     <w:sectPr>
       <w:footerReference w:type="default" r:id="rId8"/>
       <w:pgSz w:w="12240" w:h="15840"/>

</xml_diff>